<commit_message>
Corrections: tokens ~555k words per 1M, skills under Customize, Chat+Cowork merge note
</commit_message>
<xml_diff>
--- a/source/de/1-level-zero.docx
+++ b/source/de/1-level-zero.docx
@@ -402,6 +402,68 @@
         </w:tc>
       </w:tr>
     </w:tbl>
+    <w:tbl>
+      <w:tblPr>
+        <w:tblW w:type="dxa" w:w="9026"/>
+      </w:tblPr>
+      <w:tblGrid>
+        <w:gridCol w:w="9026"/>
+      </w:tblGrid>
+      <w:tr>
+        <w:trPr>
+          <w:cantSplit/>
+        </w:trPr>
+        <w:tc>
+          <w:tcPr>
+            <w:tcW w:type="dxa" w:w="9026"/>
+            <w:tcBorders>
+              <w:top w:val="single" w:color="B7892B" w:sz="2"/>
+              <w:left w:val="single" w:color="B7892B" w:sz="18"/>
+              <w:bottom w:val="single" w:color="B7892B" w:sz="2"/>
+              <w:right w:val="single" w:color="B7892B" w:sz="2"/>
+            </w:tcBorders>
+            <w:shd w:fill="FFF6E0" w:val="clear"/>
+            <w:tcMar>
+              <w:top w:type="dxa" w:w="120"/>
+              <w:left w:type="dxa" w:w="200"/>
+              <w:bottom w:type="dxa" w:w="120"/>
+              <w:right w:type="dxa" w:w="160"/>
+            </w:tcMar>
+          </w:tcPr>
+          <w:p>
+            <w:pPr>
+              <w:keepNext/>
+              <w:spacing w:after="60"/>
+            </w:pPr>
+            <w:r>
+              <w:rPr>
+                <w:b/>
+                <w:bCs/>
+                <w:color w:val="B7892B"/>
+                <w:sz w:val="22"/>
+                <w:szCs w:val="22"/>
+              </w:rPr>
+              <w:t xml:space="preserve">Chat und Cowork werden eine App</w:t>
+            </w:r>
+          </w:p>
+          <w:p>
+            <w:pPr>
+              <w:keepLines/>
+              <w:widowControl/>
+              <w:spacing w:after="60" w:line="262"/>
+            </w:pPr>
+            <w:r>
+              <w:t xml:space="preserve">Seit Ende September 2026 führt Anthropic Chat und Cowork zu einer einzigen Claude-App zusammen, zuerst bei Pro und Max. Wo dieser Leitfaden Cowork sagt, sehen Sie vielleicht einfach Claude. Die Ideen und Gewohnheiten bleiben gleich.</w:t>
+            </w:r>
+          </w:p>
+        </w:tc>
+      </w:tr>
+    </w:tbl>
+    <w:p>
+      <w:pPr>
+        <w:spacing w:after="80" w:line="120" w:lineRule="exact"/>
+      </w:pPr>
+    </w:p>
     <w:tbl>
       <w:tblPr>
         <w:tblW w:type="dxa" w:w="9026"/>
@@ -2454,7 +2516,7 @@
               <w:spacing w:after="100" w:line="262"/>
             </w:pPr>
             <w:r>
-              <w:t xml:space="preserve">Die leistungsfähigsten Modelle (Opus und Sonnet) können etwa 1.000.000 Tokens auf einmal aufnehmen (das nennt man Kontextfenster). Das sind grob 750.000 Wörter, denn ein Token entspricht etwa drei Vierteln eines Wortes. Das kleine schnelle Modell (Haiku) fasst etwa 200.000. Das ist riesig — aber wie Kapitel 12 erklärt, ist voller nicht immer besser.</w:t>
+              <w:t xml:space="preserve">Die leistungsfähigsten Modelle (Opus und Sonnet) können etwa 1.000.000 Tokens auf einmal aufnehmen (das nennt man Kontextfenster). Das sind bei den neuesten Modellen grob 555.000 Wörter (bei älteren etwa 750.000), denn ein Token entspricht etwas mehr als einem halben Wort. Das kleine schnelle Modell (Haiku) fasst etwa 200.000. Das ist riesig — aber wie Kapitel 12 erklärt, ist voller nicht immer besser.</w:t>
             </w:r>
           </w:p>
         </w:tc>
@@ -6131,7 +6193,7 @@
         <w:t xml:space="preserve">Sie verwalten sie </w:t>
       </w:r>
       <w:r>
-        <w:t xml:space="preserve">in den Settings der App, unter Capabilities. Ein Skill wird nur besser, wenn seine Datei bearbeitet wird.</w:t>
+        <w:t xml:space="preserve">in der App unter Customize, dann Skills. Ein Skill wird nur besser, wenn seine Datei bearbeitet wird.</w:t>
       </w:r>
     </w:p>
     <w:tbl>
@@ -7818,7 +7880,7 @@
                 <w:sz w:val="21"/>
                 <w:szCs w:val="21"/>
               </w:rPr>
-              <w:t xml:space="preserve">Ein Stück Text, etwa drei Viertel eines Wortes. Limits und Kosten werden in Tokens gezählt.</w:t>
+              <w:t xml:space="preserve">Ein Stück Text, je nach Modell etwa ein halbes bis drei Viertel Wort. Limits und Kosten werden in Tokens gezählt.</w:t>
             </w:r>
           </w:p>
         </w:tc>

</xml_diff>

<commit_message>
Level Zero: current model names (Opus 5.5, Sonnet 5, Haiku 4.5, Fable 5.1)
</commit_message>
<xml_diff>
--- a/source/de/1-level-zero.docx
+++ b/source/de/1-level-zero.docx
@@ -396,7 +396,7 @@
               <w:spacing w:after="100" w:line="262"/>
             </w:pPr>
             <w:r>
-              <w:t xml:space="preserve">Alles hier beschreibt Claude mit Stand August 2026: die Modellfamilien Opus, Sonnet, Haiku und Fable (Versionen um Opus 4.8, Sonnet 4.6 und das neuere Sonnet 5, Haiku 4.5, Fable 5), die Desktop-App Cowork und die neue gemeinsame Startseite, die Chat, Cowork und Ihre Projects in einer Seitenleiste zeigt. Anthropic veröffentlicht Updates extrem schnell — oft in Tagen, nicht Monaten. Ein Bildschirm, ein Menüname oder eine Modellnummer kann sich also bereits geändert haben. Wenn das, was Sie sehen, nicht zu dieser Seite passt, vertrauen Sie der App und claude.com mehr als dem Buch. Die Ideen und Gewohnheiten hier bleiben gültig, auch wenn sich die Schaltflächen verschieben.</w:t>
+              <w:t xml:space="preserve">Alles hier beschreibt Claude mit Stand August 2026: die Modellfamilien Opus, Sonnet, Haiku und Fable (erneut geprüft am 28. September 2026: Opus 5.5, Sonnet 5, Haiku 4.5 und Fable 5.1), die Desktop-App Cowork und die neue gemeinsame Startseite, die Chat, Cowork und Ihre Projects in einer Seitenleiste zeigt. Anthropic veröffentlicht Updates extrem schnell — oft in Tagen, nicht Monaten. Ein Bildschirm, ein Menüname oder eine Modellnummer kann sich also bereits geändert haben. Wenn das, was Sie sehen, nicht zu dieser Seite passt, vertrauen Sie der App und claude.com mehr als dem Buch. Die Ideen und Gewohnheiten hier bleiben gültig, auch wenn sich die Schaltflächen verschieben.</w:t>
             </w:r>
           </w:p>
         </w:tc>
@@ -2203,7 +2203,7 @@
                 <w:sz w:val="21"/>
                 <w:szCs w:val="21"/>
               </w:rPr>
-              <w:t xml:space="preserve">Opus (4.8)</w:t>
+              <w:t xml:space="preserve">Opus (5.5)</w:t>
             </w:r>
           </w:p>
         </w:tc>
@@ -2271,7 +2271,7 @@
                 <w:sz w:val="21"/>
                 <w:szCs w:val="21"/>
               </w:rPr>
-              <w:t xml:space="preserve">Sonnet (4.6)</w:t>
+              <w:t xml:space="preserve">Sonnet (5)</w:t>
             </w:r>
           </w:p>
         </w:tc>
@@ -2581,7 +2581,7 @@
               <w:spacing w:after="100" w:line="262"/>
             </w:pPr>
             <w:r>
-              <w:t xml:space="preserve">Denken Sie in Stufen, nicht in Versionsnummern: ein kleines schnelles Modell (Haiku), ein ausgewogenes (Sonnet), das leistungsfähigste (Opus) und eine noch höhere Spitzenfamilie (Fable). Anthropic veröffentlicht ständig neue Versionen — Fable 5 und ein neueres Sonnet kamen Mitte 2026 –, daher werden die genauen Nummern auf dieser Seite veralten. Was Ihnen die Modellauswahl heute zeigt, ist die Wahrheit. Wählen Sie für echte Arbeit das leistungsfähigste Modell, das Sie haben.</w:t>
+              <w:t xml:space="preserve">Denken Sie in Stufen, nicht in Versionsnummern: ein kleines schnelles Modell (Haiku), ein ausgewogenes (Sonnet), das leistungsfähigste (Opus) und eine noch höhere Spitzenfamilie (Fable). Anthropic veröffentlicht ständig neue Versionen — Fable 5.1, Opus 5.5 und Sonnet 5 kamen alle 2026 —, daher werden die genauen Nummern auf dieser Seite veralten. Was Ihnen die Modellauswahl heute zeigt, ist die Wahrheit. Wählen Sie für echte Arbeit das leistungsfähigste Modell, das Sie haben.</w:t>
             </w:r>
           </w:p>
         </w:tc>

</xml_diff>

<commit_message>
Level Zero 3.4: rewritten for the new Claude app (EN/FR/NL/DE)
</commit_message>
<xml_diff>
--- a/source/de/1-level-zero.docx
+++ b/source/de/1-level-zero.docx
@@ -151,7 +151,7 @@
           <w:sz w:val="20"/>
           <w:szCs w:val="20"/>
         </w:rPr>
-        <w:t xml:space="preserve">Version 3.3 — September 2026</w:t>
+        <w:t xml:space="preserve">Version 3.4 — September 2026</w:t>
       </w:r>
     </w:p>
     <w:p>
@@ -435,7 +435,7 @@
               <w:spacing w:after="100" w:line="262"/>
             </w:pPr>
             <w:r>
-              <w:t xml:space="preserve">Alles hier beschreibt Claude mit Stand August 2026: die Modellfamilien Opus, Sonnet, Haiku und Fable (erneut geprüft am 28. September 2026: Opus 5.5, Sonnet 5, Haiku 4.5 und Fable 5.1), die Desktop-App Cowork und die neue gemeinsame Startseite, die Chat, Cowork und Ihre Projects in einer Seitenleiste zeigt. Anthropic veröffentlicht Updates extrem schnell — oft in Tagen, nicht Monaten. Ein Bildschirm, ein Menüname oder eine Modellnummer kann sich also bereits geändert haben. Wenn das, was Sie sehen, nicht zu dieser Seite passt, vertrauen Sie der App und claude.com mehr als dem Buch. Die Ideen und Gewohnheiten hier bleiben gültig, auch wenn sich die Schaltflächen verschieben.</w:t>
+              <w:t xml:space="preserve">Alles hier beschreibt die Claude-App mit Stand vom 29. September 2026: die Modelle Opus 5.5, Sonnet 5.5, Haiku 4.5 und Fable 5.1 sowie die neue gemeinsame App, in der sich Chat und Cowork ein Nachrichtenfeld teilen. Anthropic veröffentlicht Updates extrem schnell — oft in Tagen, nicht Monaten. Ein Bildschirm, ein Menüname oder eine Modellnummer kann sich also bereits geändert haben. Wenn das, was Sie sehen, nicht zu dieser Seite passt, vertrauen Sie der App und claude.com mehr als dem Buch. Die Ideen und Gewohnheiten hier bleiben gültig, auch wenn sich die Schaltflächen verschieben.</w:t>
             </w:r>
           </w:p>
         </w:tc>
@@ -482,7 +482,7 @@
                 <w:sz w:val="22"/>
                 <w:szCs w:val="22"/>
               </w:rPr>
-              <w:t xml:space="preserve">Chat und Cowork werden eine App</w:t>
+              <w:t xml:space="preserve">Chat und Cowork sind jetzt eine App</w:t>
             </w:r>
           </w:p>
           <w:p>
@@ -492,7 +492,7 @@
               <w:spacing w:after="60" w:line="262"/>
             </w:pPr>
             <w:r>
-              <w:t xml:space="preserve">Seit Ende September 2026 führt Anthropic Chat und Cowork zu einer einzigen Claude-App zusammen, zuerst bei Pro und Max. Wo dieser Leitfaden Cowork sagt, sehen Sie vielleicht einfach Claude. Die Ideen und Gewohnheiten bleiben gleich.</w:t>
+              <w:t xml:space="preserve">Seit Ende September 2026 teilen sich Chat und Cowork ein Nachrichtenfeld, darunter ein Schalter Chat | Cowork (zuerst bei Pro und Max, andere Abos folgen). Diese Ausgabe ist für diese neue App geschrieben.</w:t>
             </w:r>
           </w:p>
         </w:tc>
@@ -612,7 +612,7 @@
                 <w:sz w:val="22"/>
                 <w:szCs w:val="22"/>
               </w:rPr>
-              <w:t xml:space="preserve">Neu in Version 3.3</w:t>
+              <w:t xml:space="preserve">Neu in Version 3.4</w:t>
             </w:r>
           </w:p>
           <w:p>
@@ -623,7 +623,7 @@
               <w:spacing w:after="100" w:line="262"/>
             </w:pPr>
             <w:r>
-              <w:t xml:space="preserve">Hinzugefügt: eine zweiseitige Anleitung „Hier beginnen“ für absolute Einsteiger; ein Weg mit dem kostenlosen Abo in Kapitel 1; eine kurze Erklärung jedes Fachbegriffs an der Stelle, wo er zuerst vorkommt; ein nach Themen gruppiertes Glossar. Aktualisiert: Persönliche Faustregeln sind jetzt als Erfahrung gekennzeichnet, nicht als Tatsache.</w:t>
+              <w:t xml:space="preserve">Neu geschrieben für die neue Claude-App, geprüft am 29. September 2026: Chat und Cowork in einem Nachrichtenfeld, Effort statt Extended Thinking, Web search im Menü +, Scheduled und Devices. Aktuelle Modelle: Opus 5.5, Sonnet 5.5, Haiku 4.5, Fable 5.1.</w:t>
             </w:r>
           </w:p>
         </w:tc>
@@ -754,7 +754,7 @@
               <w:t xml:space="preserve">claude.ai</w:t>
             </w:r>
             <w:r>
-              <w:t xml:space="preserve"> und starten einen Chat.</w:t>
+              <w:t xml:space="preserve"> und starten einen Chat (der Schalter unter dem Nachrichtenfeld bleibt auf Chat).</w:t>
             </w:r>
           </w:p>
           <w:p>
@@ -812,7 +812,7 @@
         <w:t xml:space="preserve">Installieren und anmelden. </w:t>
       </w:r>
       <w:r>
-        <w:t xml:space="preserve">Laden Sie die Desktop-App von claude.com/download herunter (Windows oder macOS) und melden Sie sich mit einem bezahlten Abo an.</w:t>
+        <w:t xml:space="preserve">Laden Sie die Desktop-App von claude.com/download herunter (Windows oder macOS) und melden Sie sich mit einem bezahlten Abo an. Die Arbeit mit Ihren Dateien läuft immer über diese App auf Ihrem PC.</w:t>
       </w:r>
     </w:p>
     <w:p>
@@ -835,7 +835,7 @@
         <w:t xml:space="preserve">Den Motor einstellen. </w:t>
       </w:r>
       <w:r>
-        <w:t xml:space="preserve">Wählen Sie das Modell Opus (das leistungsfähigste) und schalten Sie Extended Thinking (Claude denkt nach, bevor es antwortet) und Web Search (es prüft Fakten online) ein.</w:t>
+        <w:t xml:space="preserve">Klicken Sie auf den Modellnamen neben dem Nachrichtenfeld und wählen Sie Opus (das Alltagsmodell für ernsthafte Arbeit). Lassen Sie Effort auf Medium (wie gründlich Claude nachdenkt, bevor es antwortet). Prüfen Sie im Menü +, dass Web search (es prüft Fakten online) ein Häkchen hat.</w:t>
       </w:r>
     </w:p>
     <w:p>
@@ -855,7 +855,7 @@
           <w:b/>
           <w:bCs/>
         </w:rPr>
-        <w:t xml:space="preserve">Öffnen Sie Cowork (Claude arbeitet mit den Dateien in einem Ordner) und richten Sie es auf einen Ordner, </w:t>
+        <w:t xml:space="preserve">Schalten Sie unter dem Nachrichtenfeld auf Cowork um (Claude arbeitet mit den Dateien in einem Ordner) und wählen Sie einen Ordner, </w:t>
       </w:r>
       <w:r>
         <w:t xml:space="preserve">der ein Ihnen bekanntes Dokument enthält — eine PDF- oder Word-Datei.</w:t>
@@ -1074,7 +1074,7 @@
         <w:spacing w:after="100" w:line="262"/>
       </w:pPr>
       <w:r>
-        <w:t xml:space="preserve">Die meisten Menschen lernen Claude als Chatfenster auf einer Website kennen: Frage eintippen, Antwort bekommen, weiter. Das ist, als würden Sie ein Smartphone kaufen und damit nur telefonieren. Claude ist nicht ein einzelnes Ding. Es ist eine kleine Familie von Produkten mit demselben Gehirn, die aber sehr unterschiedliche Aufgaben erledigen.</w:t>
+        <w:t xml:space="preserve">Die meisten Menschen lernen Claude als Chatfenster auf einer Website kennen: Frage eintippen, Antwort bekommen, weiter. Das ist, als würden Sie ein Smartphone kaufen und damit nur telefonieren. Claude ist eine App mit einem Gehirn, kann aber sehr unterschiedliche Aufgaben erledigen. Der Schalter unter dem Nachrichtenfeld (Chat | Cowork) und einige Menüs entscheiden, welche Aufgabe es übernimmt.</w:t>
       </w:r>
     </w:p>
     <w:p>
@@ -1272,7 +1272,7 @@
                 <w:sz w:val="21"/>
                 <w:szCs w:val="21"/>
               </w:rPr>
-              <w:t xml:space="preserve">Das Gespräch auf claude.ai oder in der Desktop-App.</w:t>
+              <w:t xml:space="preserve">Die Chat-Seite des Nachrichtenfelds, auf der Website, am Desktop oder auf dem Handy.</w:t>
             </w:r>
           </w:p>
         </w:tc>
@@ -1408,7 +1408,7 @@
                 <w:sz w:val="21"/>
                 <w:szCs w:val="21"/>
               </w:rPr>
-              <w:t xml:space="preserve">Ein Desktop-Agent, der in einem Ordner auf Ihrem PC arbeitet.</w:t>
+              <w:t xml:space="preserve">Die Cowork-Seite desselben Felds: Claude arbeitet mit den Dateien in einem Ordner auf Ihrem PC.</w:t>
             </w:r>
           </w:p>
         </w:tc>
@@ -1594,7 +1594,7 @@
         <w:t xml:space="preserve">lernen, zu welchem Gesicht Sie greifen.</w:t>
       </w:r>
       <w:r>
-        <w:t xml:space="preserve"> Ein Bericht gehört in Cowork. Ein Skript gehört in Code. Eine wöchentlich wiederkehrende Aufgabe gehört in ein Project.</w:t>
+        <w:t xml:space="preserve"> Ein Bericht gehört in Cowork. Ein Skript gehört in Code. Eine wöchentlich wiederkehrende Aufgabe gehört in ein Project oder unter Scheduled.</w:t>
       </w:r>
     </w:p>
     <w:p>
@@ -2134,7 +2134,7 @@
         <w:t xml:space="preserve">Laden Sie die Desktop-App herunter, </w:t>
       </w:r>
       <w:r>
-        <w:t xml:space="preserve">von claude.com/download (Windows oder macOS). Cowork gibt es in der Desktop-App, nicht auf der Website.</w:t>
+        <w:t xml:space="preserve">von claude.com/download (Windows oder macOS). Sie können Cowork auch auf der Website oder dem Handy starten, aber die Arbeit mit Ihren Dateien läuft über die Desktop-App auf Ihrem PC (Menü + → Devices zeigt, welcher Computer).</w:t>
       </w:r>
     </w:p>
     <w:p>
@@ -2242,10 +2242,10 @@
           <w:b/>
           <w:bCs/>
         </w:rPr>
-        <w:t xml:space="preserve">Wählen Sie ein Modell. </w:t>
-      </w:r>
-      <w:r>
-        <w:t xml:space="preserve">Das ist der Motor. In einem normalen Chat können Sie das Modell bei jeder Nachricht wechseln. In einer Cowork-Unterhaltung wird das Modell aber mit der ersten Nachricht festgelegt. Wählen Sie es also, bevor Sie beginnen.</w:t>
+        <w:t xml:space="preserve">Wählen Sie ein Modell und seinen Effort. </w:t>
+      </w:r>
+      <w:r>
+        <w:t xml:space="preserve">Klicken Sie auf den Modellnamen neben dem Nachrichtenfeld. Das Modell ist der Motor; Effort bestimmt, wie gründlich es nachdenkt. In einem normalen Chat können Sie das Modell bei jeder Nachricht wechseln. In einer Cowork-Aufgabe wird das Modell aber mit der ersten Nachricht festgelegt. Wählen Sie es also, bevor Sie beginnen.</w:t>
       </w:r>
     </w:p>
     <w:tbl>
@@ -2432,7 +2432,7 @@
                 <w:sz w:val="21"/>
                 <w:szCs w:val="21"/>
               </w:rPr>
-              <w:t xml:space="preserve">Sonnet (5)</w:t>
+              <w:t xml:space="preserve">Sonnet (5.5)</w:t>
             </w:r>
           </w:p>
         </w:tc>
@@ -2612,7 +2612,7 @@
               <w:spacing w:after="100" w:line="262"/>
             </w:pPr>
             <w:r>
-              <w:t xml:space="preserve">Im Chat können Sie das Modell zwischen Nachrichten wechseln. In einer Cowork-Unterhaltung ist das Modell ab dem Moment fest, in dem Sie die erste Nachricht senden. Für ein anderes Modell starten Sie eine neue Unterhaltung (und verlieren den dort aufgebauten Kontext). Wählen Sie daher von Anfang an bewusst. Und beachten Sie den Kompromiss: Ein leistungsfähigeres Modell (Opus) liefert bessere Antworten, verbraucht aber mehr von Ihrem Token-Kontingent als Sonnet oder Haiku.</w:t>
+              <w:t xml:space="preserve">Im Chat können Sie das Modell zwischen Nachrichten wechseln. In einer Cowork-Aufgabe ist das Modell ab dem Moment fest, in dem Sie die erste Nachricht senden. Für ein anderes Modell starten Sie eine neue Aufgabe (und verlieren den dort aufgebauten Kontext). Wählen Sie daher von Anfang an bewusst. Und beachten Sie den Kompromiss: Ein leistungsfähigeres Modell oder ein höherer Effort liefert bessere Antworten, verbraucht aber mehr von Ihrem Kontingent.</w:t>
             </w:r>
           </w:p>
         </w:tc>
@@ -2742,7 +2742,7 @@
               <w:spacing w:after="100" w:line="262"/>
             </w:pPr>
             <w:r>
-              <w:t xml:space="preserve">Denken Sie in Stufen, nicht in Versionsnummern: ein kleines schnelles Modell (Haiku), ein ausgewogenes (Sonnet), das leistungsfähigste (Opus) und eine noch höhere Spitzenfamilie (Fable). Anthropic veröffentlicht ständig neue Versionen — Fable 5.1, Opus 5.5 und Sonnet 5 kamen alle 2026 —, daher werden die genauen Nummern auf dieser Seite veralten. Was Ihnen die Modellauswahl heute zeigt, ist die Wahrheit. Wählen Sie für echte Arbeit das leistungsfähigste Modell, das Sie haben.</w:t>
+              <w:t xml:space="preserve">Denken Sie in Stufen, nicht in Versionsnummern: ein kleines schnelles Modell (Haiku), ein effizientes für einfachere Aufgaben (Sonnet), das Alltagsmodell für komplexe Arbeit (Opus) und ein Spitzenmodell für die schwierigsten Herausforderungen (Fable). Anthropic veröffentlicht ständig neue Versionen — Fable 5.1, Opus 5.5 und Sonnet 5.5 kamen alle 2026 —, daher werden die genauen Nummern auf dieser Seite veralten. Was Ihnen die Modellauswahl heute zeigt, ist die Wahrheit.</w:t>
             </w:r>
           </w:p>
         </w:tc>
@@ -2765,10 +2765,10 @@
           <w:b/>
           <w:bCs/>
         </w:rPr>
-        <w:t xml:space="preserve">Schalten Sie Extended Thinking und Web Search ein. </w:t>
-      </w:r>
-      <w:r>
-        <w:t xml:space="preserve">Mit Extended Thinking denkt Claude nach, bevor es antwortet. Mit Web Search prüft es Fakten, statt zu raten — das beste Mittel gegen Erfundenes. Lassen Sie beides für ernsthafte Arbeit eingeschaltet.</w:t>
+        <w:t xml:space="preserve">Stellen Sie Effort ein und lassen Sie Web search eingeschaltet. </w:t>
+      </w:r>
+      <w:r>
+        <w:t xml:space="preserve">Effort (Low, Medium, High, Extra, Max) bestimmt, wie viel Claude nachdenkt, bevor es antwortet. Empfohlen ist Medium; höhere Stufen sind langsamer und verbrauchen Ihre Limits schneller. Mit Web search, einem Häkchen im Menü +, prüft Claude Fakten, statt zu raten — das beste Mittel gegen Erfundenes.</w:t>
       </w:r>
     </w:p>
     <w:tbl>
@@ -2891,7 +2891,7 @@
               <w:spacing w:after="100" w:line="262"/>
             </w:pPr>
             <w:r>
-              <w:t xml:space="preserve">Nach meiner Erfahrung machen Opus + Extended Thinking + Web Search den größten Unterschied bei Ihren Ergebnissen. Die Einrichtung dauert eine Minute.</w:t>
+              <w:t xml:space="preserve">Nach meiner Erfahrung machen Opus mit Effort auf Medium (High für die schwierigen Aufgaben) und eingeschaltetem Web search den größten Unterschied bei Ihren Ergebnissen. Die Einrichtung dauert eine Minute.</w:t>
             </w:r>
           </w:p>
         </w:tc>
@@ -3640,10 +3640,10 @@
           <w:b/>
           <w:bCs/>
         </w:rPr>
-        <w:t xml:space="preserve">Lassen Sie Web Search eingeschaltet, </w:t>
-      </w:r>
-      <w:r>
-        <w:t xml:space="preserve">damit Claude Fakten an aktuellen Quellen prüft, statt aus dem Gedächtnis zu raten.</w:t>
+        <w:t xml:space="preserve">Lassen Sie Web search eingeschaltet </w:t>
+      </w:r>
+      <w:r>
+        <w:t xml:space="preserve">(ein Häkchen im Menü +), damit Claude Fakten an aktuellen Quellen prüft, statt aus dem Gedächtnis zu raten.</w:t>
       </w:r>
     </w:p>
     <w:p>
@@ -4163,7 +4163,7 @@
                 <w:sz w:val="21"/>
                 <w:szCs w:val="21"/>
               </w:rPr>
-              <w:t xml:space="preserve">Die Website und die Desktop-App sind dasselbe.</w:t>
+              <w:t xml:space="preserve">Cowork gibt es nur in der Desktop-App.</w:t>
             </w:r>
           </w:p>
         </w:tc>
@@ -4184,7 +4184,7 @@
                 <w:sz w:val="21"/>
                 <w:szCs w:val="21"/>
               </w:rPr>
-              <w:t xml:space="preserve">Die Desktop-App kann viel mehr — Cowork und Code gibt es nur dort.</w:t>
+              <w:t xml:space="preserve">Sie können Cowork auf der Website oder dem Handy starten, aber die Arbeit mit Ihren Dateien läuft über die Desktop-App auf Ihrem PC. Installieren Sie sie.</w:t>
             </w:r>
           </w:p>
         </w:tc>
@@ -4777,7 +4777,7 @@
         <w:spacing w:after="100" w:line="262"/>
       </w:pPr>
       <w:r>
-        <w:t xml:space="preserve">Cowork ist die wichtigste Veränderung in der Art, wie Claude genutzt wird. Es ist eine Desktop-App, die auf einen Ordner auf Ihrem Computer zeigt und ihn als Arbeitsbereich behandelt. Es liest Ihre Dateien, schreibt neue, führt im Hintergrund Code aus und stellt Ihnen Fragen, bevor es etwas Wichtiges tut.</w:t>
+        <w:t xml:space="preserve">Cowork ist die wichtigste Veränderung in der Art, wie Claude genutzt wird. Schalten Sie das Nachrichtenfeld auf Cowork um, und Claude nutzt einen Ordner auf Ihrem Computer als Arbeitsbereich. Es liest Ihre Dateien, schreibt neue, führt im Hintergrund Code aus und stellt Ihnen Fragen, bevor es etwas Wichtiges tut.</w:t>
       </w:r>
     </w:p>
     <w:p>
@@ -4798,7 +4798,7 @@
         <w:t xml:space="preserve">Mitarbeiter</w:t>
       </w:r>
       <w:r>
-        <w:t xml:space="preserve">. Sie beschreiben das gewünschte Ergebnis. Es liest die passenden Dateien, klärt Rückfragen über ein anklickbares Formular und kommt mit einem fertigen Ergebnis zurück. Seit Mitte 2026 ist es allgemein in allen bezahlten Abos (Pro, Max, Team und Enterprise) verfügbar, über die Desktop-App für Windows und macOS. Diese teilt sich jetzt eine Startseite mit Chat — Ihre Projects stehen in der linken Seitenleiste. Wenn eines nach einem Update verschwunden scheint, schauen Sie dort nach oder nutzen Sie die Suche.</w:t>
+        <w:t xml:space="preserve">. Sie beschreiben das gewünschte Ergebnis. Es liest die passenden Dateien, klärt Rückfragen über ein anklickbares Formular und kommt mit einem fertigen Ergebnis zurück. Es ist in den bezahlten Abos verfügbar (Pro, Max, Team und Enterprise). Sie können eine Aufgabe auf der Website, auf dem Handy oder in der Desktop-App starten; die Arbeit mit Ihren Dateien läuft über die Desktop-App auf Ihrem PC. Menü + → Devices zeigt, welcher Computer.</w:t>
       </w:r>
     </w:p>
     <w:tbl>
@@ -5151,10 +5151,10 @@
           <w:b/>
           <w:bCs/>
         </w:rPr>
-        <w:t xml:space="preserve">Geplante Aufgaben </w:t>
-      </w:r>
-      <w:r>
-        <w:t xml:space="preserve">lassen eine gespeicherte Routine selbstständig laufen — etwa eine Übersicht an jedem Werktag um 7 Uhr (Ihr Computer muss dafür eingeschaltet sein).</w:t>
+        <w:t xml:space="preserve">Scheduled </w:t>
+      </w:r>
+      <w:r>
+        <w:t xml:space="preserve">(in der linken Seitenleiste) lässt eine gespeicherte Routine selbstständig laufen — etwa eine Übersicht an jedem Werktag um 7 Uhr (Ihr Computer muss dafür eingeschaltet sein).</w:t>
       </w:r>
     </w:p>
     <w:p>
@@ -5174,10 +5174,10 @@
           <w:b/>
           <w:bCs/>
         </w:rPr>
-        <w:t xml:space="preserve">Dispatch </w:t>
-      </w:r>
-      <w:r>
-        <w:t xml:space="preserve">erlaubt Ihnen, Claude eine Aufgabe vom Handy aus zu geben; die Desktop-App erledigt die Arbeit, und Sie öffnen das Ergebnis später. Beta in Pro und Max; braucht sowohl die Desktop- als auch die Handy-App.</w:t>
+        <w:t xml:space="preserve">Devices </w:t>
+      </w:r>
+      <w:r>
+        <w:t xml:space="preserve">(Menü + in Cowork) erlaubt Ihnen, eine Aufgabe vom Handy oder von der Website aus zu starten und zu wählen, welcher Ihrer Computer sie ausführt; die Desktop-App erledigt die Arbeit, und Sie öffnen das Ergebnis später.</w:t>
       </w:r>
     </w:p>
     <w:p>
@@ -5605,7 +5605,7 @@
                 <w:sz w:val="21"/>
                 <w:szCs w:val="21"/>
               </w:rPr>
-              <w:t xml:space="preserve">Keine geplanten Aufgaben.</w:t>
+              <w:t xml:space="preserve">Nichts unter Scheduled.</w:t>
             </w:r>
           </w:p>
         </w:tc>
@@ -6843,7 +6843,7 @@
               <w:spacing w:after="100" w:line="262"/>
             </w:pPr>
             <w:r>
-              <w:t xml:space="preserve">Neu in Cowork (Mitte 2026): Öffnen Sie in der Desktop-App das Menü + und wählen Sie „Record a skill“. Claude zeichnet Ihren Bildschirm und Ihre Stimme auf, während Sie die Aufgabe einmal erledigen — Sie erklären dabei laut Ihre Entscheidungen –, und macht daraus einen wiederverwendbaren Skill. Sie müssen nichts schreiben. Das ist der bequemste Einstieg für eine Aufgabe, die sich leichter zeigen als beschreiben lässt. Zeichnen Sie keine Passwörter, Geheimnisse oder privaten Informationen auf. Verfügbar in Pro, Max und Team.</w:t>
+              <w:t xml:space="preserve">Neu in Cowork (Mitte 2026): Öffnen Sie in der Desktop-App das Menü + und wählen Sie „Record a skill“ (falls angezeigt). Claude zeichnet Ihren Bildschirm und Ihre Stimme auf, während Sie die Aufgabe einmal erledigen — Sie erklären dabei laut Ihre Entscheidungen –, und macht daraus einen wiederverwendbaren Skill. Sie müssen nichts schreiben. Das ist der bequemste Einstieg für eine Aufgabe, die sich leichter zeigen als beschreiben lässt. Zeichnen Sie keine Passwörter, Geheimnisse oder privaten Informationen auf.</w:t>
             </w:r>
           </w:p>
         </w:tc>
@@ -7151,7 +7151,7 @@
         <w:t xml:space="preserve">Prüfen Sie alles, was wichtig ist. </w:t>
       </w:r>
       <w:r>
-        <w:t xml:space="preserve">Kontrollieren Sie bei Zahlen, rechtlichen oder finanziellen Entscheidungen die Quelle — und nutzen Sie Web Search, damit auch Claude prüft.</w:t>
+        <w:t xml:space="preserve">Kontrollieren Sie bei Zahlen, rechtlichen oder finanziellen Entscheidungen die Quelle — und nutzen Sie Web search, damit auch Claude prüft.</w:t>
       </w:r>
     </w:p>
     <w:tbl>
@@ -8005,7 +8005,7 @@
         <w:spacing w:after="46" w:line="258"/>
       </w:pPr>
       <w:r>
-        <w:t xml:space="preserve">Stellen Sie das Modell auf Opus und schalten Sie Extended Thinking und Web Search ein.</w:t>
+        <w:t xml:space="preserve">Stellen Sie das Modell auf Opus und Effort auf Medium; prüfen Sie, dass Web search im Menü + ein Häkchen hat.</w:t>
       </w:r>
     </w:p>
     <w:p>
@@ -8037,7 +8037,7 @@
         <w:spacing w:after="46" w:line="258"/>
       </w:pPr>
       <w:r>
-        <w:t xml:space="preserve">Öffnen Sie Cowork und richten Sie es auf diesen Ordner.</w:t>
+        <w:t xml:space="preserve">Schalten Sie das Nachrichtenfeld auf Cowork um und wählen Sie diesen Ordner.</w:t>
       </w:r>
     </w:p>
     <w:p>
@@ -8672,7 +8672,7 @@
                 <w:sz w:val="21"/>
                 <w:szCs w:val="21"/>
               </w:rPr>
-              <w:t xml:space="preserve">Extended Thinking</w:t>
+              <w:t xml:space="preserve">Effort</w:t>
             </w:r>
           </w:p>
         </w:tc>
@@ -8696,7 +8696,7 @@
                 <w:sz w:val="21"/>
                 <w:szCs w:val="21"/>
               </w:rPr>
-              <w:t xml:space="preserve">Ein Modus, in dem Claude nachdenkt, bevor es antwortet.</w:t>
+              <w:t xml:space="preserve">Wie gründlich Claude nachdenkt, bevor es antwortet: Low, Medium (empfohlen), High, Extra, Max.</w:t>
             </w:r>
           </w:p>
         </w:tc>
@@ -8725,7 +8725,7 @@
                 <w:sz w:val="21"/>
                 <w:szCs w:val="21"/>
               </w:rPr>
-              <w:t xml:space="preserve">Web Search</w:t>
+              <w:t xml:space="preserve">Web search</w:t>
             </w:r>
           </w:p>
         </w:tc>
@@ -8749,7 +8749,7 @@
                 <w:sz w:val="21"/>
                 <w:szCs w:val="21"/>
               </w:rPr>
-              <w:t xml:space="preserve">Lässt Claude Fakten online prüfen, statt zu raten.</w:t>
+              <w:t xml:space="preserve">Lässt Claude Fakten online prüfen, statt zu raten. Ein Häkchen im Menü +.</w:t>
             </w:r>
           </w:p>
         </w:tc>
@@ -8956,7 +8956,7 @@
                 <w:sz w:val="21"/>
                 <w:szCs w:val="21"/>
               </w:rPr>
-              <w:t xml:space="preserve">Der Desktop-Agent, der in einem Ordner arbeitet und fertige Dateien erstellt.</w:t>
+              <w:t xml:space="preserve">Der Modus des Nachrichtenfelds, in dem Claude in einem Ordner arbeitet und fertige Dateien erstellt.</w:t>
             </w:r>
           </w:p>
         </w:tc>
@@ -9616,7 +9616,7 @@
                 <w:sz w:val="21"/>
                 <w:szCs w:val="21"/>
               </w:rPr>
-              <w:t xml:space="preserve">Dispatch</w:t>
+              <w:t xml:space="preserve">Devices</w:t>
             </w:r>
           </w:p>
         </w:tc>
@@ -9640,7 +9640,7 @@
                 <w:sz w:val="21"/>
                 <w:szCs w:val="21"/>
               </w:rPr>
-              <w:t xml:space="preserve">Eine Cowork-Aufgabe vom Handy aus starten; der Desktop-Computer erledigt die Arbeit.</w:t>
+              <w:t xml:space="preserve">Auswählen, welcher Ihrer Computer eine Cowork-Aufgabe ausführt (Menü + → Devices).</w:t>
             </w:r>
           </w:p>
         </w:tc>

</xml_diff>